<commit_message>
Update awards, add AGU membership, extend My Story
- Name the awarding department for the two travel awards
- Add AGU membership (Aug. 2025)
- Add a paragraph on collaboration and music to My Story
- Crop the invention fair photo to reduce empty space
- Tighten letter spacing when a date would otherwise wrap to the next line
</commit_message>
<xml_diff>
--- a/assets/pdf/Hyunje-Yang-CV.docx
+++ b/assets/pdf/Hyunje-Yang-CV.docx
@@ -4304,21 +4304,22 @@
           <w:tab w:pos="10800" w:val="right"/>
         </w:tabs>
         <w:spacing w:before="0" w:after="0" w:line="240" w:lineRule="auto"/>
-        <w:jc w:val="both"/>
-        <w:keepLines/>
-        <w:numPr>
-          <w:ilvl w:val="0"/>
-          <w:numId w:val="3"/>
-        </w:numPr>
-      </w:pPr>
-      <w:r>
-        <w:rPr>
-          <w:b w:val="0"/>
-          <w:i w:val="0"/>
-          <w:sz w:val="20"/>
-          <w:u w:val="none"/>
-        </w:rPr>
-        <w:t>Kolodzey Travel Awards, American Geophysical Union Fall Meeting 2025</w:t>
+        <w:jc w:val="left"/>
+        <w:keepLines/>
+        <w:numPr>
+          <w:ilvl w:val="0"/>
+          <w:numId w:val="3"/>
+        </w:numPr>
+      </w:pPr>
+      <w:r>
+        <w:rPr>
+          <w:b w:val="0"/>
+          <w:i w:val="0"/>
+          <w:sz w:val="20"/>
+          <w:u w:val="none"/>
+        </w:rPr>
+        <w:t>Kolodzey Travel Award, Department of Civil, Architectural and Environmental Engineering, UT Austin (to attend the American Geophysical Union Fall Meeting 2025)</w:t>
+        <w:br/>
       </w:r>
       <w:r>
         <w:tab/>
@@ -4339,21 +4340,22 @@
           <w:tab w:pos="10800" w:val="right"/>
         </w:tabs>
         <w:spacing w:before="0" w:after="0" w:line="240" w:lineRule="auto"/>
-        <w:jc w:val="both"/>
-        <w:keepLines/>
-        <w:numPr>
-          <w:ilvl w:val="0"/>
-          <w:numId w:val="3"/>
-        </w:numPr>
-      </w:pPr>
-      <w:r>
-        <w:rPr>
-          <w:b w:val="0"/>
-          <w:i w:val="0"/>
-          <w:sz w:val="20"/>
-          <w:u w:val="none"/>
-        </w:rPr>
-        <w:t>Goyette Travel Awards, 10th Young Coastal Scientists and Engineers Conference - Americas</w:t>
+        <w:jc w:val="left"/>
+        <w:keepLines/>
+        <w:numPr>
+          <w:ilvl w:val="0"/>
+          <w:numId w:val="3"/>
+        </w:numPr>
+      </w:pPr>
+      <w:r>
+        <w:rPr>
+          <w:b w:val="0"/>
+          <w:i w:val="0"/>
+          <w:sz w:val="20"/>
+          <w:u w:val="none"/>
+        </w:rPr>
+        <w:t>Goyette Travel Award, Department of Civil, Architectural and Environmental Engineering, UT Austin (to attend the 10th Young Coastal Scientists and Engineers Conference - Americas)</w:t>
+        <w:br/>
       </w:r>
       <w:r>
         <w:tab/>
@@ -4549,24 +4551,27 @@
           <w:tab w:pos="10800" w:val="right"/>
         </w:tabs>
         <w:spacing w:before="0" w:after="0" w:line="240" w:lineRule="auto"/>
-        <w:jc w:val="left"/>
-        <w:keepLines/>
-        <w:numPr>
-          <w:ilvl w:val="0"/>
-          <w:numId w:val="3"/>
-        </w:numPr>
-      </w:pPr>
-      <w:r>
-        <w:rPr>
-          <w:b w:val="0"/>
-          <w:i w:val="0"/>
-          <w:sz w:val="20"/>
-          <w:u w:val="none"/>
+        <w:jc w:val="both"/>
+        <w:keepLines/>
+        <w:numPr>
+          <w:ilvl w:val="0"/>
+          <w:numId w:val="3"/>
+        </w:numPr>
+      </w:pPr>
+      <w:r>
+        <w:rPr>
+          <w:b w:val="0"/>
+          <w:i w:val="0"/>
+          <w:sz w:val="20"/>
+          <w:u w:val="none"/>
+          <w:spacing w:val="-2"/>
         </w:rPr>
         <w:t>Best Poster Award, JSPS Core-to-Core Program, Asian University Forests Consortium 7th International Symposium</w:t>
-        <w:br/>
-      </w:r>
-      <w:r>
+      </w:r>
+      <w:r>
+        <w:rPr>
+          <w:spacing w:val="-2"/>
+        </w:rPr>
         <w:tab/>
       </w:r>
       <w:r>
@@ -4575,6 +4580,7 @@
           <w:i/>
           <w:sz w:val="20"/>
           <w:u w:val="none"/>
+          <w:spacing w:val="-2"/>
         </w:rPr>
         <w:t>Oct. 2016</w:t>
       </w:r>
@@ -4832,7 +4838,7 @@
           <w:sz w:val="20"/>
           <w:u w:val="none"/>
         </w:rPr>
-        <w:t>International Forestry Students' Association</w:t>
+        <w:t>American Geophysical Union (AGU)</w:t>
       </w:r>
       <w:r>
         <w:tab/>
@@ -4844,58 +4850,7 @@
           <w:sz w:val="20"/>
           <w:u w:val="none"/>
         </w:rPr>
-        <w:t>Feb. 2014 – Feb. 2016</w:t>
-      </w:r>
-    </w:p>
-    <w:p>
-      <w:pPr>
-        <w:keepLines/>
-        <w:spacing w:before="0" w:after="0" w:line="240" w:lineRule="auto"/>
-        <w:ind w:left="864"/>
-        <w:jc w:val="both"/>
-      </w:pPr>
-      <w:r>
-        <w:rPr>
-          <w:b w:val="0"/>
-          <w:i w:val="0"/>
-          <w:sz w:val="20"/>
-          <w:u w:val="none"/>
-        </w:rPr>
-        <w:t>Poster presentation: "Urban and School Forest in Korea," 2015 Asia Pacific Regional Meeting in Taiwan.</w:t>
-      </w:r>
-    </w:p>
-    <w:p>
-      <w:pPr>
-        <w:keepLines/>
-        <w:spacing w:before="0" w:after="0" w:line="240" w:lineRule="auto"/>
-        <w:ind w:left="864"/>
-        <w:jc w:val="both"/>
-      </w:pPr>
-      <w:r>
-        <w:rPr>
-          <w:b w:val="0"/>
-          <w:i w:val="0"/>
-          <w:sz w:val="20"/>
-          <w:u w:val="none"/>
-        </w:rPr>
-        <w:t>Discussed forest science issues and held academic seminars with other student members.</w:t>
-      </w:r>
-    </w:p>
-    <w:p>
-      <w:pPr>
-        <w:keepNext/>
-        <w:keepLines/>
-        <w:spacing w:before="40" w:after="0" w:line="240" w:lineRule="auto"/>
-        <w:jc w:val="both"/>
-      </w:pPr>
-      <w:r>
-        <w:rPr>
-          <w:b/>
-          <w:i w:val="0"/>
-          <w:sz w:val="20"/>
-          <w:u w:val="none"/>
-        </w:rPr>
-        <w:t>Leadership:</w:t>
+        <w:t>Aug. 2025 – Present</w:t>
       </w:r>
     </w:p>
     <w:p>
@@ -4918,7 +4873,7 @@
           <w:sz w:val="20"/>
           <w:u w:val="none"/>
         </w:rPr>
-        <w:t>President, CAEE at UT Austin Korean Student Organization</w:t>
+        <w:t>International Forestry Students' Association</w:t>
       </w:r>
       <w:r>
         <w:tab/>
@@ -4930,7 +4885,58 @@
           <w:sz w:val="20"/>
           <w:u w:val="none"/>
         </w:rPr>
-        <w:t>Jan. 2026 – Present</w:t>
+        <w:t>Feb. 2014 – Feb. 2016</w:t>
+      </w:r>
+    </w:p>
+    <w:p>
+      <w:pPr>
+        <w:keepLines/>
+        <w:spacing w:before="0" w:after="0" w:line="240" w:lineRule="auto"/>
+        <w:ind w:left="864"/>
+        <w:jc w:val="both"/>
+      </w:pPr>
+      <w:r>
+        <w:rPr>
+          <w:b w:val="0"/>
+          <w:i w:val="0"/>
+          <w:sz w:val="20"/>
+          <w:u w:val="none"/>
+        </w:rPr>
+        <w:t>Poster presentation: "Urban and School Forest in Korea," 2015 Asia Pacific Regional Meeting in Taiwan.</w:t>
+      </w:r>
+    </w:p>
+    <w:p>
+      <w:pPr>
+        <w:keepLines/>
+        <w:spacing w:before="0" w:after="0" w:line="240" w:lineRule="auto"/>
+        <w:ind w:left="864"/>
+        <w:jc w:val="both"/>
+      </w:pPr>
+      <w:r>
+        <w:rPr>
+          <w:b w:val="0"/>
+          <w:i w:val="0"/>
+          <w:sz w:val="20"/>
+          <w:u w:val="none"/>
+        </w:rPr>
+        <w:t>Discussed forest science issues and held academic seminars with other student members.</w:t>
+      </w:r>
+    </w:p>
+    <w:p>
+      <w:pPr>
+        <w:keepNext/>
+        <w:keepLines/>
+        <w:spacing w:before="40" w:after="0" w:line="240" w:lineRule="auto"/>
+        <w:jc w:val="both"/>
+      </w:pPr>
+      <w:r>
+        <w:rPr>
+          <w:b/>
+          <w:i w:val="0"/>
+          <w:sz w:val="20"/>
+          <w:u w:val="none"/>
+        </w:rPr>
+        <w:t>Leadership:</w:t>
       </w:r>
     </w:p>
     <w:p>
@@ -4953,7 +4959,7 @@
           <w:sz w:val="20"/>
           <w:u w:val="none"/>
         </w:rPr>
-        <w:t>President, UT Austin Korean Student Association</w:t>
+        <w:t>President, CAEE at UT Austin Korean Student Organization</w:t>
       </w:r>
       <w:r>
         <w:tab/>
@@ -4965,7 +4971,7 @@
           <w:sz w:val="20"/>
           <w:u w:val="none"/>
         </w:rPr>
-        <w:t>Sep. 2023 – Aug. 2024</w:t>
+        <w:t>Jan. 2026 – Present</w:t>
       </w:r>
     </w:p>
     <w:p>
@@ -4988,7 +4994,7 @@
           <w:sz w:val="20"/>
           <w:u w:val="none"/>
         </w:rPr>
-        <w:t>Volunteer, Habitat for Humanity: Served 100+ hours and built 5+ houses</w:t>
+        <w:t>President, UT Austin Korean Student Association</w:t>
       </w:r>
       <w:r>
         <w:tab/>
@@ -5000,7 +5006,7 @@
           <w:sz w:val="20"/>
           <w:u w:val="none"/>
         </w:rPr>
-        <w:t>Feb. 2013 – Feb. 2015</w:t>
+        <w:t>Sep. 2023 – Aug. 2024</w:t>
       </w:r>
     </w:p>
     <w:p>
@@ -5023,9 +5029,48 @@
           <w:sz w:val="20"/>
           <w:u w:val="none"/>
         </w:rPr>
+        <w:t>Volunteer, Habitat for Humanity: Served 100+ hours and built 5+ houses</w:t>
+      </w:r>
+      <w:r>
+        <w:tab/>
+      </w:r>
+      <w:r>
+        <w:rPr>
+          <w:b w:val="0"/>
+          <w:i/>
+          <w:sz w:val="20"/>
+          <w:u w:val="none"/>
+        </w:rPr>
+        <w:t>Feb. 2013 – Feb. 2015</w:t>
+      </w:r>
+    </w:p>
+    <w:p>
+      <w:pPr>
+        <w:tabs>
+          <w:tab w:pos="10800" w:val="right"/>
+        </w:tabs>
+        <w:spacing w:before="0" w:after="0" w:line="240" w:lineRule="auto"/>
+        <w:jc w:val="both"/>
+        <w:keepLines/>
+        <w:numPr>
+          <w:ilvl w:val="0"/>
+          <w:numId w:val="3"/>
+        </w:numPr>
+      </w:pPr>
+      <w:r>
+        <w:rPr>
+          <w:b w:val="0"/>
+          <w:i w:val="0"/>
+          <w:sz w:val="20"/>
+          <w:u w:val="none"/>
+          <w:spacing w:val="-1"/>
+        </w:rPr>
         <w:t>President and Founder, 'WITHYOU' Education Volunteer Club: Tutored math to low-income students</w:t>
       </w:r>
       <w:r>
+        <w:rPr>
+          <w:spacing w:val="-1"/>
+        </w:rPr>
         <w:tab/>
       </w:r>
       <w:r>
@@ -5034,6 +5079,7 @@
           <w:i/>
           <w:sz w:val="20"/>
           <w:u w:val="none"/>
+          <w:spacing w:val="-1"/>
         </w:rPr>
         <w:t>Mar. 2009 – Mar. 2013</w:t>
       </w:r>

</xml_diff>